<commit_message>
Review Item 2: unknown field fallback pattern (Sample <Label>)
Changed the unknown-field fallback from '<Label> Example' to 'Sample <Label>'
for more natural phrasing (e.g. 'Sample Notes' instead of 'Notes Example').

Also added comprehensive demo showing all 7 intents in one requirement:
- Positive (realistic, executable values)
- Boundary (20-char limit grounded in requirement)
- Duplicate
- SQL injection
- XSS
- Whitespace
- Unicode

Files: COMPREHENSIVE_DEMO.txt (readable), COMPREHENSIVE_OUTPUT.csv (111 rows)
</commit_message>
<xml_diff>
--- a/SPRINT3_TESTDATA_PROOF.docx
+++ b/SPRINT3_TESTDATA_PROOF.docx
@@ -529,7 +529,7 @@
         <w:rPr>
           <w:rStyle w:val="VerbatimChar"/>
         </w:rPr>
-        <w:t xml:space="preserve">"&lt;Label&gt; Example"</w:t>
+        <w:t xml:space="preserve">"Sample &lt;Label&gt;"</w:t>
       </w:r>
       <w:r>
         <w:t xml:space="preserve"> </w:t>
@@ -541,7 +541,7 @@
         <w:rPr>
           <w:rStyle w:val="VerbatimChar"/>
         </w:rPr>
-        <w:t xml:space="preserve">"Notes Example"</w:t>
+        <w:t xml:space="preserve">"Sample Notes"</w:t>
       </w:r>
       <w:r>
         <w:t xml:space="preserve">), never</w:t>
@@ -1046,7 +1046,7 @@
               <w:rPr>
                 <w:rStyle w:val="VerbatimChar"/>
               </w:rPr>
-              <w:t xml:space="preserve">"Notes Example"</w:t>
+              <w:t xml:space="preserve">"Sample Notes"</w:t>
             </w:r>
           </w:p>
         </w:tc>

</xml_diff>